<commit_message>
build application folder structure
</commit_message>
<xml_diff>
--- a/documents/ds de tai java.docx
+++ b/documents/ds de tai java.docx
@@ -54,7 +54,6 @@
           <w:b/>
           <w:bCs/>
           <w:sz w:val="50"/>
-          <w:lang w:val="en-US"/>
         </w:rPr>
         <w:t>5</w:t>
       </w:r>
@@ -73,7 +72,6 @@
           <w:b/>
           <w:bCs/>
           <w:sz w:val="50"/>
-          <w:lang w:val="en-US"/>
         </w:rPr>
         <w:t>6</w:t>
       </w:r>
@@ -95,7 +93,6 @@
           <w:rFonts w:ascii="Times New Roman" w:hAnsi="Times New Roman" w:cs="Times New Roman"/>
           <w:sz w:val="28"/>
           <w:szCs w:val="28"/>
-          <w:lang w:val="en-US"/>
         </w:rPr>
       </w:pPr>
     </w:p>
@@ -107,7 +104,6 @@
           <w:rFonts w:ascii="Times New Roman" w:hAnsi="Times New Roman" w:cs="Times New Roman"/>
           <w:sz w:val="28"/>
           <w:szCs w:val="28"/>
-          <w:lang w:val="en-US"/>
         </w:rPr>
       </w:pPr>
       <w:r>
@@ -115,69 +111,16 @@
           <w:rFonts w:ascii="Times New Roman" w:hAnsi="Times New Roman" w:cs="Times New Roman"/>
           <w:sz w:val="28"/>
           <w:szCs w:val="28"/>
-          <w:lang w:val="en-US"/>
-        </w:rPr>
-        <w:t xml:space="preserve">Quản </w:t>
-      </w:r>
-      <w:proofErr w:type="spellStart"/>
+        </w:rPr>
+        <w:t>Quản lý bán vé tại 1 rạp chiếu phim</w:t>
+      </w:r>
       <w:r>
         <w:rPr>
           <w:rFonts w:ascii="Times New Roman" w:hAnsi="Times New Roman" w:cs="Times New Roman"/>
           <w:sz w:val="28"/>
           <w:szCs w:val="28"/>
-          <w:lang w:val="en-US"/>
-        </w:rPr>
-        <w:t>lý</w:t>
-      </w:r>
-      <w:proofErr w:type="spellEnd"/>
-      <w:r>
-        <w:rPr>
-          <w:rFonts w:ascii="Times New Roman" w:hAnsi="Times New Roman" w:cs="Times New Roman"/>
-          <w:sz w:val="28"/>
-          <w:szCs w:val="28"/>
-          <w:lang w:val="en-US"/>
-        </w:rPr>
-        <w:t xml:space="preserve"> </w:t>
-      </w:r>
-      <w:proofErr w:type="spellStart"/>
-      <w:r>
-        <w:rPr>
-          <w:rFonts w:ascii="Times New Roman" w:hAnsi="Times New Roman" w:cs="Times New Roman"/>
-          <w:sz w:val="28"/>
-          <w:szCs w:val="28"/>
-          <w:lang w:val="en-US"/>
-        </w:rPr>
-        <w:t>bán</w:t>
-      </w:r>
-      <w:proofErr w:type="spellEnd"/>
-      <w:r>
-        <w:rPr>
-          <w:rFonts w:ascii="Times New Roman" w:hAnsi="Times New Roman" w:cs="Times New Roman"/>
-          <w:sz w:val="28"/>
-          <w:szCs w:val="28"/>
-          <w:lang w:val="en-US"/>
-        </w:rPr>
-        <w:t xml:space="preserve"> </w:t>
-      </w:r>
-      <w:proofErr w:type="spellStart"/>
-      <w:r>
-        <w:rPr>
-          <w:rFonts w:ascii="Times New Roman" w:hAnsi="Times New Roman" w:cs="Times New Roman"/>
-          <w:sz w:val="28"/>
-          <w:szCs w:val="28"/>
-          <w:lang w:val="en-US"/>
-        </w:rPr>
-        <w:t>vé</w:t>
-      </w:r>
-      <w:proofErr w:type="spellEnd"/>
-      <w:r>
-        <w:rPr>
-          <w:rFonts w:ascii="Times New Roman" w:hAnsi="Times New Roman" w:cs="Times New Roman"/>
-          <w:sz w:val="28"/>
-          <w:szCs w:val="28"/>
-          <w:lang w:val="en-US"/>
-        </w:rPr>
-        <w:t xml:space="preserve"> tại 1 rạp chiếu phim</w:t>
+        </w:rPr>
+        <w:t xml:space="preserve"> (Không có đối tượng khách hàng, chỉ có nhân viên (doanh nghiệp))</w:t>
       </w:r>
     </w:p>
     <w:p>
@@ -211,38 +154,14 @@
           <w:i/>
           <w:iCs/>
           <w:sz w:val="26"/>
-          <w:lang w:val="en-US"/>
-        </w:rPr>
-      </w:pPr>
-      <w:r>
-        <w:rPr>
-          <w:rFonts w:ascii="Times New Roman" w:hAnsi="Times New Roman" w:cs="Times New Roman"/>
-          <w:sz w:val="26"/>
-        </w:rPr>
-        <w:t>Sinh viên khảo sát và xây dựng phần mềm</w:t>
-      </w:r>
-      <w:r>
-        <w:rPr>
-          <w:rFonts w:ascii="Times New Roman" w:hAnsi="Times New Roman" w:cs="Times New Roman"/>
-          <w:sz w:val="26"/>
-          <w:lang w:val="en-US"/>
-        </w:rPr>
-        <w:t xml:space="preserve"> </w:t>
-      </w:r>
-      <w:r>
-        <w:rPr>
-          <w:rFonts w:ascii="Times New Roman" w:hAnsi="Times New Roman" w:cs="Times New Roman"/>
-          <w:sz w:val="26"/>
-        </w:rPr>
-        <w:t xml:space="preserve">chỉ phục vụ cho nhân viên </w:t>
-      </w:r>
-      <w:r>
-        <w:rPr>
-          <w:rFonts w:ascii="Times New Roman" w:hAnsi="Times New Roman" w:cs="Times New Roman"/>
-          <w:sz w:val="26"/>
-          <w:lang w:val="en-US"/>
-        </w:rPr>
-        <w:t>(không viết ứng dụng cho người mua)</w:t>
+        </w:rPr>
+      </w:pPr>
+      <w:r>
+        <w:rPr>
+          <w:rFonts w:ascii="Times New Roman" w:hAnsi="Times New Roman" w:cs="Times New Roman"/>
+          <w:sz w:val="26"/>
+        </w:rPr>
+        <w:t>Sinh viên khảo sát và xây dựng phần mềm chỉ phục vụ cho nhân viên (không viết ứng dụng cho người mua)</w:t>
       </w:r>
     </w:p>
     <w:p>
@@ -263,7 +182,6 @@
         <w:rPr>
           <w:rFonts w:ascii="Times New Roman" w:hAnsi="Times New Roman" w:cs="Times New Roman"/>
           <w:sz w:val="26"/>
-          <w:lang w:val="en-US"/>
         </w:rPr>
         <w:t>Về tài liệu</w:t>
       </w:r>
@@ -290,7 +208,6 @@
           <w:i/>
           <w:iCs/>
           <w:sz w:val="26"/>
-          <w:lang w:val="en-US"/>
         </w:rPr>
         <w:t>Phần 1: Thu thập và phân tích yêu cầu</w:t>
       </w:r>
@@ -317,7 +234,6 @@
           <w:i/>
           <w:iCs/>
           <w:sz w:val="26"/>
-          <w:lang w:val="en-US"/>
         </w:rPr>
         <w:t>Phần 2: Thiết kế  sơ đồ lớp (class diagram) + mô tả các ràng buộc</w:t>
       </w:r>
@@ -344,7 +260,6 @@
           <w:i/>
           <w:iCs/>
           <w:sz w:val="26"/>
-          <w:lang w:val="en-US"/>
         </w:rPr>
         <w:t>Phần 3: Sơ dồ CSDL (Database diagram) + Mô tả</w:t>
       </w:r>
@@ -371,7 +286,6 @@
           <w:i/>
           <w:iCs/>
           <w:sz w:val="26"/>
-          <w:lang w:val="en-US"/>
         </w:rPr>
         <w:t>Phần 4: Hiện thực (chụp và mô tả các màn hình chính)</w:t>
       </w:r>
@@ -394,7 +308,6 @@
         <w:rPr>
           <w:rFonts w:ascii="Times New Roman" w:hAnsi="Times New Roman" w:cs="Times New Roman"/>
           <w:sz w:val="26"/>
-          <w:lang w:val="en-US"/>
         </w:rPr>
         <w:t xml:space="preserve"> </w:t>
       </w:r>
@@ -446,7 +359,6 @@
         <w:rPr>
           <w:rFonts w:ascii="Times New Roman" w:hAnsi="Times New Roman" w:cs="Times New Roman"/>
           <w:sz w:val="26"/>
-          <w:lang w:val="en-US"/>
         </w:rPr>
         <w:t>Chương trình xử lý được nghiệp vụ chính: lập hóa đơn bán, xuất được  hóa đơn.</w:t>
       </w:r>
@@ -469,7 +381,6 @@
         <w:rPr>
           <w:rFonts w:ascii="Times New Roman" w:hAnsi="Times New Roman" w:cs="Times New Roman"/>
           <w:sz w:val="26"/>
-          <w:lang w:val="en-US"/>
         </w:rPr>
         <w:t>Xử lý được nghiệp vụ thống kê cơ bản</w:t>
       </w:r>
@@ -499,7 +410,6 @@
         <w:rPr>
           <w:rFonts w:ascii="Times New Roman" w:hAnsi="Times New Roman" w:cs="Times New Roman"/>
           <w:sz w:val="26"/>
-          <w:lang w:val="en-US"/>
         </w:rPr>
         <w:t xml:space="preserve"> (khuyến kích dùng các control nâng cao, mở rộng…)</w:t>
       </w:r>
@@ -529,18 +439,11 @@
         <w:rPr>
           <w:rFonts w:ascii="Times New Roman" w:hAnsi="Times New Roman" w:cs="Times New Roman"/>
           <w:sz w:val="26"/>
-          <w:lang w:val="en-US"/>
         </w:rPr>
         <w:t>.</w:t>
       </w:r>
     </w:p>
-    <w:p>
-      <w:pPr>
-        <w:rPr>
-          <w:lang w:val="en-US"/>
-        </w:rPr>
-      </w:pPr>
-    </w:p>
+    <w:p/>
     <w:sectPr>
       <w:pgSz w:w="12240" w:h="15840"/>
       <w:pgMar w:top="1440" w:right="1440" w:bottom="1440" w:left="1440" w:header="708" w:footer="708" w:gutter="0"/>
@@ -1027,7 +930,7 @@
         <w:rFonts w:asciiTheme="minorHAnsi" w:eastAsiaTheme="minorHAnsi" w:hAnsiTheme="minorHAnsi" w:cstheme="minorBidi"/>
         <w:sz w:val="24"/>
         <w:szCs w:val="24"/>
-        <w:lang w:eastAsia="en-US" w:bidi="ar-SA"/>
+        <w:lang w:val="en-US" w:eastAsia="en-US" w:bidi="ar-SA"/>
       </w:rPr>
     </w:rPrDefault>
     <w:pPrDefault/>

</xml_diff>